<commit_message>
RIB Book 1 strict rescore fixes: tea callback matches the Epilogue, clock-bag and printout continuity, flight time and Oxford Street dusk facts, course-format and internal-note lines cleaned, duplicate review ask removed; metric formula corrected (dx^nu) and moved to Lesson 15, new Newton/Einstein apple and door diagrams, images beside their captions with alt text; curly quotes; KDP blurb accuracy, keywords and categories (old files in Book 1/bak as pre-rescore)
</commit_message>
<xml_diff>
--- a/The Relativistic Investigation Bureau - SERIES/Book 1 - The Murder That Hadnt Happened Yet/kdp_description.docx
+++ b/The Relativistic Investigation Bureau - SERIES/Book 1 - The Murder That Hadnt Happened Yet/kdp_description.docx
@@ -14,7 +14,7 @@
         <w:br/>
         <w:t>A photograph from tomorrow.</w:t>
         <w:br/>
-        <w:t>And a bureaucratic error that might save his daughter — or doom her.</w:t>
+        <w:t>And a filing error that has put his daughter in the picture.</w:t>
       </w:r>
     </w:p>
     <w:p>
@@ -22,7 +22,7 @@
         <w:pStyle w:val="BodyText"/>
       </w:pPr>
       <w:r>
-        <w:t>At 9:17 on a Tuesday morning, investigator Derek Gent receives an email informing him that he has been murdered. The message is polite, precise, and signed by Derek himself. Worse, the attached photograph shows him face-down on his own office floor, timestamped tomorrow at 11:03 a.m. — and frozen in the doorway behind him, mid-step, is his twelve-year-old daughter.</w:t>
+        <w:t>At 9:17 on a Tuesday morning, investigator Derek Gent receives an email informing him that he has been murdered. The message is polite, precise, and signed by Derek himself. Worse, the attached photograph shows him face-down on his own office floor, a brass clock on the desk reading 11:03 — the email says tomorrow — and frozen in the doorway behind him, mid-step, is his twelve-year-old daughter.</w:t>
       </w:r>
     </w:p>
     <w:p>
@@ -68,7 +68,7 @@
         <w:shd w:val="clear" w:color="auto" w:fill="191C22"/>
       </w:pPr>
       <w:r>
-        <w:t>The Murder That Hadn't Happened Yet is Book 1 of the Relativistic Investigation Bureau — a mystery where the physics is real, the jokes are dry, and the only way out is through the equations.</w:t>
+        <w:t>The Murder That Hadn't Happened Yet is Book 1 of the Relativistic Investigation Bureau — a mystery where the physics is real, the jokes are dry, and the only way out is to read the clocks properly. No physics needed to follow the case; sixteen short lessons at the back explain the real relativity behind every clue, for readers who want it.</w:t>
       </w:r>
     </w:p>
     <w:sectPr>

</xml_diff>

<commit_message>
RIB Book 1 strict rescore 8.6 to 9.1: continuity, facts, corrected metric formula and two new diagrams with alt text, curly quotes, KDP blurb/keywords/categories; SCORES row and book summary (per-path from book-2-lectures-after-qed)
</commit_message>
<xml_diff>
--- a/The Relativistic Investigation Bureau - SERIES/Book 1 - The Murder That Hadnt Happened Yet/kdp_description.docx
+++ b/The Relativistic Investigation Bureau - SERIES/Book 1 - The Murder That Hadnt Happened Yet/kdp_description.docx
@@ -14,7 +14,7 @@
         <w:br/>
         <w:t>A photograph from tomorrow.</w:t>
         <w:br/>
-        <w:t>And a bureaucratic error that might save his daughter — or doom her.</w:t>
+        <w:t>And a filing error that has put his daughter in the picture.</w:t>
       </w:r>
     </w:p>
     <w:p>
@@ -22,7 +22,7 @@
         <w:pStyle w:val="BodyText"/>
       </w:pPr>
       <w:r>
-        <w:t>At 9:17 on a Tuesday morning, investigator Derek Gent receives an email informing him that he has been murdered. The message is polite, precise, and signed by Derek himself. Worse, the attached photograph shows him face-down on his own office floor, timestamped tomorrow at 11:03 a.m. — and frozen in the doorway behind him, mid-step, is his twelve-year-old daughter.</w:t>
+        <w:t>At 9:17 on a Tuesday morning, investigator Derek Gent receives an email informing him that he has been murdered. The message is polite, precise, and signed by Derek himself. Worse, the attached photograph shows him face-down on his own office floor, a brass clock on the desk reading 11:03 — the email says tomorrow — and frozen in the doorway behind him, mid-step, is his twelve-year-old daughter.</w:t>
       </w:r>
     </w:p>
     <w:p>
@@ -68,7 +68,7 @@
         <w:shd w:val="clear" w:color="auto" w:fill="191C22"/>
       </w:pPr>
       <w:r>
-        <w:t>The Murder That Hadn't Happened Yet is Book 1 of the Relativistic Investigation Bureau — a mystery where the physics is real, the jokes are dry, and the only way out is through the equations.</w:t>
+        <w:t>The Murder That Hadn't Happened Yet is Book 1 of the Relativistic Investigation Bureau — a mystery where the physics is real, the jokes are dry, and the only way out is to read the clocks properly. No physics needed to follow the case; sixteen short lessons at the back explain the real relativity behind every clue, for readers who want it.</w:t>
       </w:r>
     </w:p>
     <w:sectPr>

</xml_diff>

<commit_message>
Refresh Bureau series editions and handoff materials
</commit_message>
<xml_diff>
--- a/The Relativistic Investigation Bureau - SERIES/Book 1 - The Murder That Hadnt Happened Yet/kdp_description.docx
+++ b/The Relativistic Investigation Bureau - SERIES/Book 1 - The Murder That Hadnt Happened Yet/kdp_description.docx
@@ -77,6 +77,11 @@
       <w:cols w:space="720"/>
       <w:formProt w:val="0"/>
     </w:sectPr>
+    <w:p>
+      <w:r>
+        <w:t xml:space="preserve">Recommended for readers aged 14 and up. Strong readers aged 12 to 13 may also enjoy the mystery, with adult support for the denser physics discussions.</w:t>
+      </w:r>
+    </w:p>
   </w:body>
 </w:document>
 </file>

</xml_diff>